<commit_message>
Apply v001 review comments to analytical section
</commit_message>
<xml_diff>
--- a/40 - Projects/Диплом/build/Диплом_ГришинИД_v002.docx
+++ b/40 - Projects/Диплом/build/Диплом_ГришинИД_v002.docx
@@ -5438,7 +5438,7 @@
         <w:pStyle w:val="FirstParagraph"/>
       </w:pPr>
       <w:r>
-        <w:t xml:space="preserve">Проектируемая СППР связывает прогноз клиентского спроса с планом размещения. Применение плана требует решения администратора и безопасного изменения расположения версий.</w:t>
+        <w:t xml:space="preserve">В аналитическом разделе требования из исследовательского раздела преобразуются в проект СППР: описываются математическое и алгоритмическое обеспечение, модели процессов управления размещением и архитектура системы, обосновывается выбор инструментов реализации. Проектируемая СППР связывает прогноз клиентского спроса с планом размещения, а применение плана требует решения администратора и безопасного изменения расположения версий.</w:t>
       </w:r>
     </w:p>
     <w:bookmarkStart w:id="72" w:name="X84bd9294f1307ff8601e5cfa6da9c74af29fe47"/>
@@ -5476,7 +5476,7 @@
         <w:pStyle w:val="FirstParagraph"/>
       </w:pPr>
       <w:r>
-        <w:t xml:space="preserve">В каждом цикле планирования для текущей версии каждого объекта выбирается класс хранения HOT или COLD так, чтобы уменьшить ожидаемую суммарную задержку клиентских чтений за горизонт прогноза. На входе задачи прогноз спроса и состояние каталога Metadata, на выходе план переносов. Выбор ограничен ёмкостью классов, бюджетом копирования и закреплёнными объектами: объекты с запретом переноса, участвующие в выполняемом переносе или перенесённые раньше минимального интервала, сохраняют текущее размещение. Предыдущие версии в задачу не входят, но их объём учитывается в ограничениях ёмкости. Задача реализует функциональное требование F-05 с учётом ограничений ресурсов и периода цикла планирования из раздела 1.3.5 пояснительной записки. Обозначения модели размещения приведены в Таблице 2.1.</w:t>
+        <w:t xml:space="preserve">В каждом цикле планирования для текущей версии каждого объекта выбирается класс хранения HOT или COLD так, чтобы уменьшить ожидаемую суммарную задержку клиентских чтений за горизонт прогноза. На входе задачи прогноз спроса и метаданные хранилища о версиях объектов, их размерах, размещении и занятости классов, на выходе план переносов. Выбор ограничен ёмкостью классов, бюджетом копирования и закреплёнными объектами: объекты с запретом переноса, участвующие в выполняемом переносе или перенесённые раньше минимального интервала, сохраняют текущее размещение. Предыдущие версии в задачу не входят, но их объём учитывается в ограничениях ёмкости. Задача реализует функциональное требование F-05 с учётом ограничений ресурсов и периода цикла планирования из раздела 1.3.5 пояснительной записки. Обозначения модели размещения приведены в Таблице 2.1.</w:t>
       </w:r>
     </w:p>
     <w:bookmarkStart w:id="55" w:name="gost-tbl:notation"/>
@@ -5513,9 +5513,7 @@
       </w:tblPr>
       <w:tblGrid>
         <w:gridCol w:w="1841"/>
-        <w:gridCol w:w="3851"/>
-        <w:gridCol w:w="1270"/>
-        <w:gridCol w:w="2676"/>
+        <w:gridCol w:w="7797"/>
       </w:tblGrid>
       <w:tr>
         <w:trPr>
@@ -5548,7 +5546,7 @@
         </w:tc>
         <w:tc>
           <w:tcPr>
-            <w:tcW w:w="3851" w:type="dxa"/>
+            <w:tcW w:w="7797" w:type="dxa"/>
           </w:tcPr>
           <w:p>
             <w:pPr>
@@ -5567,54 +5565,6 @@
                 <w:szCs w:val="24"/>
               </w:rPr>
               <w:t xml:space="preserve">Смысл</w:t>
-            </w:r>
-          </w:p>
-        </w:tc>
-        <w:tc>
-          <w:tcPr>
-            <w:tcW w:w="1270" w:type="dxa"/>
-          </w:tcPr>
-          <w:p>
-            <w:pPr>
-              <w:pStyle w:val="Compact"/>
-              <w:keepNext w:val="0"/>
-              <w:pageBreakBefore w:val="0"/>
-              <w:suppressAutoHyphens w:val="1"/>
-              <w:spacing w:before="0" w:after="0" w:line="240" w:lineRule="auto"/>
-              <w:ind w:firstLine="0" w:left="0" w:right="0"/>
-              <w:jc w:val="center"/>
-            </w:pPr>
-            <w:r>
-              <w:rPr>
-                <w:b w:val="1"/>
-                <w:sz w:val="24"/>
-                <w:szCs w:val="24"/>
-              </w:rPr>
-              <w:t xml:space="preserve">Единица</w:t>
-            </w:r>
-          </w:p>
-        </w:tc>
-        <w:tc>
-          <w:tcPr>
-            <w:tcW w:w="2676" w:type="dxa"/>
-          </w:tcPr>
-          <w:p>
-            <w:pPr>
-              <w:pStyle w:val="Compact"/>
-              <w:keepNext w:val="0"/>
-              <w:pageBreakBefore w:val="0"/>
-              <w:suppressAutoHyphens w:val="1"/>
-              <w:spacing w:before="0" w:after="0" w:line="240" w:lineRule="auto"/>
-              <w:ind w:firstLine="0" w:left="0" w:right="0"/>
-              <w:jc w:val="center"/>
-            </w:pPr>
-            <w:r>
-              <w:rPr>
-                <w:b w:val="1"/>
-                <w:sz w:val="24"/>
-                <w:szCs w:val="24"/>
-              </w:rPr>
-              <w:t xml:space="preserve">Откуда значение</w:t>
             </w:r>
           </w:p>
         </w:tc>
@@ -5646,7 +5596,7 @@
         </w:tc>
         <w:tc>
           <w:tcPr>
-            <w:tcW w:w="3851" w:type="dxa"/>
+            <w:tcW w:w="7797" w:type="dxa"/>
           </w:tcPr>
           <w:p>
             <w:pPr>
@@ -5664,52 +5614,6 @@
                 <w:szCs w:val="24"/>
               </w:rPr>
               <w:t xml:space="preserve">Момент начала цикла планирования</w:t>
-            </w:r>
-          </w:p>
-        </w:tc>
-        <w:tc>
-          <w:tcPr>
-            <w:tcW w:w="1270" w:type="dxa"/>
-          </w:tcPr>
-          <w:p>
-            <w:pPr>
-              <w:pStyle w:val="Compact"/>
-              <w:keepNext w:val="0"/>
-              <w:pageBreakBefore w:val="0"/>
-              <w:suppressAutoHyphens w:val="1"/>
-              <w:spacing w:before="0" w:after="0" w:line="240" w:lineRule="auto"/>
-              <w:ind w:firstLine="0" w:left="0" w:right="0"/>
-              <w:jc w:val="both"/>
-            </w:pPr>
-            <w:r>
-              <w:rPr>
-                <w:sz w:val="24"/>
-                <w:szCs w:val="24"/>
-              </w:rPr>
-              <w:t xml:space="preserve">время</w:t>
-            </w:r>
-          </w:p>
-        </w:tc>
-        <w:tc>
-          <w:tcPr>
-            <w:tcW w:w="2676" w:type="dxa"/>
-          </w:tcPr>
-          <w:p>
-            <w:pPr>
-              <w:pStyle w:val="Compact"/>
-              <w:keepNext w:val="0"/>
-              <w:pageBreakBefore w:val="0"/>
-              <w:suppressAutoHyphens w:val="1"/>
-              <w:spacing w:before="0" w:after="0" w:line="240" w:lineRule="auto"/>
-              <w:ind w:firstLine="0" w:left="0" w:right="0"/>
-              <w:jc w:val="both"/>
-            </w:pPr>
-            <w:r>
-              <w:rPr>
-                <w:sz w:val="24"/>
-                <w:szCs w:val="24"/>
-              </w:rPr>
-              <w:t xml:space="preserve">Расписание цикла планирования</w:t>
             </w:r>
           </w:p>
         </w:tc>
@@ -5741,7 +5645,7 @@
         </w:tc>
         <w:tc>
           <w:tcPr>
-            <w:tcW w:w="3851" w:type="dxa"/>
+            <w:tcW w:w="7797" w:type="dxa"/>
           </w:tcPr>
           <w:p>
             <w:pPr>
@@ -5758,7 +5662,7 @@
                 <w:sz w:val="24"/>
                 <w:szCs w:val="24"/>
               </w:rPr>
-              <w:t xml:space="preserve">Множество объектов, текущие версии которых зарегистрированы в Metadata в момент</w:t>
+              <w:t xml:space="preserve">Множество объектов, текущие версии которых зарегистрированы в хранилище в момент</w:t>
             </w:r>
             <w:r>
               <w:rPr>
@@ -5819,52 +5723,6 @@
             </m:oMath>
           </w:p>
         </w:tc>
-        <w:tc>
-          <w:tcPr>
-            <w:tcW w:w="1270" w:type="dxa"/>
-          </w:tcPr>
-          <w:p>
-            <w:pPr>
-              <w:pStyle w:val="Compact"/>
-              <w:keepNext w:val="0"/>
-              <w:pageBreakBefore w:val="0"/>
-              <w:suppressAutoHyphens w:val="1"/>
-              <w:spacing w:before="0" w:after="0" w:line="240" w:lineRule="auto"/>
-              <w:ind w:firstLine="0" w:left="0" w:right="0"/>
-              <w:jc w:val="both"/>
-            </w:pPr>
-            <w:r>
-              <w:rPr>
-                <w:sz w:val="24"/>
-                <w:szCs w:val="24"/>
-              </w:rPr>
-              <w:t xml:space="preserve">—</w:t>
-            </w:r>
-          </w:p>
-        </w:tc>
-        <w:tc>
-          <w:tcPr>
-            <w:tcW w:w="2676" w:type="dxa"/>
-          </w:tcPr>
-          <w:p>
-            <w:pPr>
-              <w:pStyle w:val="Compact"/>
-              <w:keepNext w:val="0"/>
-              <w:pageBreakBefore w:val="0"/>
-              <w:suppressAutoHyphens w:val="1"/>
-              <w:spacing w:before="0" w:after="0" w:line="240" w:lineRule="auto"/>
-              <w:ind w:firstLine="0" w:left="0" w:right="0"/>
-              <w:jc w:val="both"/>
-            </w:pPr>
-            <w:r>
-              <w:rPr>
-                <w:sz w:val="24"/>
-                <w:szCs w:val="24"/>
-              </w:rPr>
-              <w:t xml:space="preserve">Каталог Metadata</w:t>
-            </w:r>
-          </w:p>
-        </w:tc>
       </w:tr>
       <w:tr>
         <w:trPr>
@@ -5893,7 +5751,7 @@
         </w:tc>
         <w:tc>
           <w:tcPr>
-            <w:tcW w:w="3851" w:type="dxa"/>
+            <w:tcW w:w="7797" w:type="dxa"/>
           </w:tcPr>
           <w:p>
             <w:pPr>
@@ -5911,52 +5769,6 @@
                 <w:szCs w:val="24"/>
               </w:rPr>
               <w:t xml:space="preserve">Класс хранения, HOT или COLD</w:t>
-            </w:r>
-          </w:p>
-        </w:tc>
-        <w:tc>
-          <w:tcPr>
-            <w:tcW w:w="1270" w:type="dxa"/>
-          </w:tcPr>
-          <w:p>
-            <w:pPr>
-              <w:pStyle w:val="Compact"/>
-              <w:keepNext w:val="0"/>
-              <w:pageBreakBefore w:val="0"/>
-              <w:suppressAutoHyphens w:val="1"/>
-              <w:spacing w:before="0" w:after="0" w:line="240" w:lineRule="auto"/>
-              <w:ind w:firstLine="0" w:left="0" w:right="0"/>
-              <w:jc w:val="both"/>
-            </w:pPr>
-            <w:r>
-              <w:rPr>
-                <w:sz w:val="24"/>
-                <w:szCs w:val="24"/>
-              </w:rPr>
-              <w:t xml:space="preserve">—</w:t>
-            </w:r>
-          </w:p>
-        </w:tc>
-        <w:tc>
-          <w:tcPr>
-            <w:tcW w:w="2676" w:type="dxa"/>
-          </w:tcPr>
-          <w:p>
-            <w:pPr>
-              <w:pStyle w:val="Compact"/>
-              <w:keepNext w:val="0"/>
-              <w:pageBreakBefore w:val="0"/>
-              <w:suppressAutoHyphens w:val="1"/>
-              <w:spacing w:before="0" w:after="0" w:line="240" w:lineRule="auto"/>
-              <w:ind w:firstLine="0" w:left="0" w:right="0"/>
-              <w:jc w:val="both"/>
-            </w:pPr>
-            <w:r>
-              <w:rPr>
-                <w:sz w:val="24"/>
-                <w:szCs w:val="24"/>
-              </w:rPr>
-              <w:t xml:space="preserve">Каталог Metadata</w:t>
             </w:r>
           </w:p>
         </w:tc>
@@ -5997,7 +5809,7 @@
         </w:tc>
         <w:tc>
           <w:tcPr>
-            <w:tcW w:w="3851" w:type="dxa"/>
+            <w:tcW w:w="7797" w:type="dxa"/>
           </w:tcPr>
           <w:p>
             <w:pPr>
@@ -6028,51 +5840,12 @@
                 <m:t>i</m:t>
               </m:r>
             </m:oMath>
-          </w:p>
-        </w:tc>
-        <w:tc>
-          <w:tcPr>
-            <w:tcW w:w="1270" w:type="dxa"/>
-          </w:tcPr>
-          <w:p>
-            <w:pPr>
-              <w:pStyle w:val="Compact"/>
-              <w:keepNext w:val="0"/>
-              <w:pageBreakBefore w:val="0"/>
-              <w:suppressAutoHyphens w:val="1"/>
-              <w:spacing w:before="0" w:after="0" w:line="240" w:lineRule="auto"/>
-              <w:ind w:firstLine="0" w:left="0" w:right="0"/>
-              <w:jc w:val="both"/>
-            </w:pPr>
-            <w:r>
-              <w:rPr>
-                <w:sz w:val="24"/>
-                <w:szCs w:val="24"/>
-              </w:rPr>
-              <w:t xml:space="preserve">МиБ</w:t>
-            </w:r>
-          </w:p>
-        </w:tc>
-        <w:tc>
-          <w:tcPr>
-            <w:tcW w:w="2676" w:type="dxa"/>
-          </w:tcPr>
-          <w:p>
-            <w:pPr>
-              <w:pStyle w:val="Compact"/>
-              <w:keepNext w:val="0"/>
-              <w:pageBreakBefore w:val="0"/>
-              <w:suppressAutoHyphens w:val="1"/>
-              <w:spacing w:before="0" w:after="0" w:line="240" w:lineRule="auto"/>
-              <w:ind w:firstLine="0" w:left="0" w:right="0"/>
-              <w:jc w:val="both"/>
-            </w:pPr>
-            <w:r>
-              <w:rPr>
-                <w:sz w:val="24"/>
-                <w:szCs w:val="24"/>
-              </w:rPr>
-              <w:t xml:space="preserve">Каталог Metadata</w:t>
+            <w:r>
+              <w:rPr>
+                <w:sz w:val="24"/>
+                <w:szCs w:val="24"/>
+              </w:rPr>
+              <w:t xml:space="preserve">, МиБ</w:t>
             </w:r>
           </w:p>
         </w:tc>
@@ -6133,7 +5906,7 @@
         </w:tc>
         <w:tc>
           <w:tcPr>
-            <w:tcW w:w="3851" w:type="dxa"/>
+            <w:tcW w:w="7797" w:type="dxa"/>
           </w:tcPr>
           <w:p>
             <w:pPr>
@@ -6170,52 +5943,6 @@
                 <w:szCs w:val="24"/>
               </w:rPr>
               <w:t xml:space="preserve">, HOT или COLD</w:t>
-            </w:r>
-          </w:p>
-        </w:tc>
-        <w:tc>
-          <w:tcPr>
-            <w:tcW w:w="1270" w:type="dxa"/>
-          </w:tcPr>
-          <w:p>
-            <w:pPr>
-              <w:pStyle w:val="Compact"/>
-              <w:keepNext w:val="0"/>
-              <w:pageBreakBefore w:val="0"/>
-              <w:suppressAutoHyphens w:val="1"/>
-              <w:spacing w:before="0" w:after="0" w:line="240" w:lineRule="auto"/>
-              <w:ind w:firstLine="0" w:left="0" w:right="0"/>
-              <w:jc w:val="both"/>
-            </w:pPr>
-            <w:r>
-              <w:rPr>
-                <w:sz w:val="24"/>
-                <w:szCs w:val="24"/>
-              </w:rPr>
-              <w:t xml:space="preserve">—</w:t>
-            </w:r>
-          </w:p>
-        </w:tc>
-        <w:tc>
-          <w:tcPr>
-            <w:tcW w:w="2676" w:type="dxa"/>
-          </w:tcPr>
-          <w:p>
-            <w:pPr>
-              <w:pStyle w:val="Compact"/>
-              <w:keepNext w:val="0"/>
-              <w:pageBreakBefore w:val="0"/>
-              <w:suppressAutoHyphens w:val="1"/>
-              <w:spacing w:before="0" w:after="0" w:line="240" w:lineRule="auto"/>
-              <w:ind w:firstLine="0" w:left="0" w:right="0"/>
-              <w:jc w:val="both"/>
-            </w:pPr>
-            <w:r>
-              <w:rPr>
-                <w:sz w:val="24"/>
-                <w:szCs w:val="24"/>
-              </w:rPr>
-              <w:t xml:space="preserve">Каталог Metadata</w:t>
             </w:r>
           </w:p>
         </w:tc>
@@ -6256,7 +5983,7 @@
         </w:tc>
         <w:tc>
           <w:tcPr>
-            <w:tcW w:w="3851" w:type="dxa"/>
+            <w:tcW w:w="7797" w:type="dxa"/>
           </w:tcPr>
           <w:p>
             <w:pPr>
@@ -6303,52 +6030,6 @@
             </w:r>
           </w:p>
         </w:tc>
-        <w:tc>
-          <w:tcPr>
-            <w:tcW w:w="1270" w:type="dxa"/>
-          </w:tcPr>
-          <w:p>
-            <w:pPr>
-              <w:pStyle w:val="Compact"/>
-              <w:keepNext w:val="0"/>
-              <w:pageBreakBefore w:val="0"/>
-              <w:suppressAutoHyphens w:val="1"/>
-              <w:spacing w:before="0" w:after="0" w:line="240" w:lineRule="auto"/>
-              <w:ind w:firstLine="0" w:left="0" w:right="0"/>
-              <w:jc w:val="both"/>
-            </w:pPr>
-            <w:r>
-              <w:rPr>
-                <w:sz w:val="24"/>
-                <w:szCs w:val="24"/>
-              </w:rPr>
-              <w:t xml:space="preserve">—</w:t>
-            </w:r>
-          </w:p>
-        </w:tc>
-        <w:tc>
-          <w:tcPr>
-            <w:tcW w:w="2676" w:type="dxa"/>
-          </w:tcPr>
-          <w:p>
-            <w:pPr>
-              <w:pStyle w:val="Compact"/>
-              <w:keepNext w:val="0"/>
-              <w:pageBreakBefore w:val="0"/>
-              <w:suppressAutoHyphens w:val="1"/>
-              <w:spacing w:before="0" w:after="0" w:line="240" w:lineRule="auto"/>
-              <w:ind w:firstLine="0" w:left="0" w:right="0"/>
-              <w:jc w:val="both"/>
-            </w:pPr>
-            <w:r>
-              <w:rPr>
-                <w:sz w:val="24"/>
-                <w:szCs w:val="24"/>
-              </w:rPr>
-              <w:t xml:space="preserve">Решение алгоритма</w:t>
-            </w:r>
-          </w:p>
-        </w:tc>
       </w:tr>
       <w:tr>
         <w:trPr>
@@ -6377,7 +6058,7 @@
         </w:tc>
         <w:tc>
           <w:tcPr>
-            <w:tcW w:w="3851" w:type="dxa"/>
+            <w:tcW w:w="7797" w:type="dxa"/>
           </w:tcPr>
           <w:p>
             <w:pPr>
@@ -6395,52 +6076,6 @@
                 <w:szCs w:val="24"/>
               </w:rPr>
               <w:t xml:space="preserve">Горизонт прогноза</w:t>
-            </w:r>
-          </w:p>
-        </w:tc>
-        <w:tc>
-          <w:tcPr>
-            <w:tcW w:w="1270" w:type="dxa"/>
-          </w:tcPr>
-          <w:p>
-            <w:pPr>
-              <w:pStyle w:val="Compact"/>
-              <w:keepNext w:val="0"/>
-              <w:pageBreakBefore w:val="0"/>
-              <w:suppressAutoHyphens w:val="1"/>
-              <w:spacing w:before="0" w:after="0" w:line="240" w:lineRule="auto"/>
-              <w:ind w:firstLine="0" w:left="0" w:right="0"/>
-              <w:jc w:val="both"/>
-            </w:pPr>
-            <w:r>
-              <w:rPr>
-                <w:sz w:val="24"/>
-                <w:szCs w:val="24"/>
-              </w:rPr>
-              <w:t xml:space="preserve">время</w:t>
-            </w:r>
-          </w:p>
-        </w:tc>
-        <w:tc>
-          <w:tcPr>
-            <w:tcW w:w="2676" w:type="dxa"/>
-          </w:tcPr>
-          <w:p>
-            <w:pPr>
-              <w:pStyle w:val="Compact"/>
-              <w:keepNext w:val="0"/>
-              <w:pageBreakBefore w:val="0"/>
-              <w:suppressAutoHyphens w:val="1"/>
-              <w:spacing w:before="0" w:after="0" w:line="240" w:lineRule="auto"/>
-              <w:ind w:firstLine="0" w:left="0" w:right="0"/>
-              <w:jc w:val="both"/>
-            </w:pPr>
-            <w:r>
-              <w:rPr>
-                <w:sz w:val="24"/>
-                <w:szCs w:val="24"/>
-              </w:rPr>
-              <w:t xml:space="preserve">Подбирается на данных настройки</w:t>
             </w:r>
           </w:p>
         </w:tc>
@@ -6496,7 +6131,7 @@
         </w:tc>
         <w:tc>
           <w:tcPr>
-            <w:tcW w:w="3851" w:type="dxa"/>
+            <w:tcW w:w="7797" w:type="dxa"/>
           </w:tcPr>
           <w:p>
             <w:pPr>
@@ -6588,7 +6223,14 @@
                 <w:sz w:val="24"/>
                 <w:szCs w:val="24"/>
               </w:rPr>
-              <w:t xml:space="preserve">, далее</w:t>
+              <w:t xml:space="preserve"> </w:t>
+            </w:r>
+            <w:r>
+              <w:rPr>
+                <w:sz w:val="24"/>
+                <w:szCs w:val="24"/>
+              </w:rPr>
+              <w:t xml:space="preserve">по формуле (2.14), далее</w:t>
             </w:r>
             <w:r>
               <w:rPr>
@@ -6611,52 +6253,6 @@
                 </m:sub>
               </m:sSub>
             </m:oMath>
-          </w:p>
-        </w:tc>
-        <w:tc>
-          <w:tcPr>
-            <w:tcW w:w="1270" w:type="dxa"/>
-          </w:tcPr>
-          <w:p>
-            <w:pPr>
-              <w:pStyle w:val="Compact"/>
-              <w:keepNext w:val="0"/>
-              <w:pageBreakBefore w:val="0"/>
-              <w:suppressAutoHyphens w:val="1"/>
-              <w:spacing w:before="0" w:after="0" w:line="240" w:lineRule="auto"/>
-              <w:ind w:firstLine="0" w:left="0" w:right="0"/>
-              <w:jc w:val="both"/>
-            </w:pPr>
-            <w:r>
-              <w:rPr>
-                <w:sz w:val="24"/>
-                <w:szCs w:val="24"/>
-              </w:rPr>
-              <w:t xml:space="preserve">—</w:t>
-            </w:r>
-          </w:p>
-        </w:tc>
-        <w:tc>
-          <w:tcPr>
-            <w:tcW w:w="2676" w:type="dxa"/>
-          </w:tcPr>
-          <w:p>
-            <w:pPr>
-              <w:pStyle w:val="Compact"/>
-              <w:keepNext w:val="0"/>
-              <w:pageBreakBefore w:val="0"/>
-              <w:suppressAutoHyphens w:val="1"/>
-              <w:spacing w:before="0" w:after="0" w:line="240" w:lineRule="auto"/>
-              <w:ind w:firstLine="0" w:left="0" w:right="0"/>
-              <w:jc w:val="both"/>
-            </w:pPr>
-            <w:r>
-              <w:rPr>
-                <w:sz w:val="24"/>
-                <w:szCs w:val="24"/>
-              </w:rPr>
-              <w:t xml:space="preserve">Вычисляется по формуле (2.14)</w:t>
-            </w:r>
           </w:p>
         </w:tc>
       </w:tr>
@@ -6703,7 +6299,7 @@
         </w:tc>
         <w:tc>
           <w:tcPr>
-            <w:tcW w:w="3851" w:type="dxa"/>
+            <w:tcW w:w="7797" w:type="dxa"/>
           </w:tcPr>
           <w:p>
             <w:pPr>
@@ -6790,51 +6386,19 @@
                 <m:t>)</m:t>
               </m:r>
             </m:oMath>
-          </w:p>
-        </w:tc>
-        <w:tc>
-          <w:tcPr>
-            <w:tcW w:w="1270" w:type="dxa"/>
-          </w:tcPr>
-          <w:p>
-            <w:pPr>
-              <w:pStyle w:val="Compact"/>
-              <w:keepNext w:val="0"/>
-              <w:pageBreakBefore w:val="0"/>
-              <w:suppressAutoHyphens w:val="1"/>
-              <w:spacing w:before="0" w:after="0" w:line="240" w:lineRule="auto"/>
-              <w:ind w:firstLine="0" w:left="0" w:right="0"/>
-              <w:jc w:val="both"/>
-            </w:pPr>
-            <w:r>
-              <w:rPr>
-                <w:sz w:val="24"/>
-                <w:szCs w:val="24"/>
-              </w:rPr>
-              <w:t xml:space="preserve">—</w:t>
-            </w:r>
-          </w:p>
-        </w:tc>
-        <w:tc>
-          <w:tcPr>
-            <w:tcW w:w="2676" w:type="dxa"/>
-          </w:tcPr>
-          <w:p>
-            <w:pPr>
-              <w:pStyle w:val="Compact"/>
-              <w:keepNext w:val="0"/>
-              <w:pageBreakBefore w:val="0"/>
-              <w:suppressAutoHyphens w:val="1"/>
-              <w:spacing w:before="0" w:after="0" w:line="240" w:lineRule="auto"/>
-              <w:ind w:firstLine="0" w:left="0" w:right="0"/>
-              <w:jc w:val="both"/>
-            </w:pPr>
-            <w:r>
-              <w:rPr>
-                <w:sz w:val="24"/>
-                <w:szCs w:val="24"/>
-              </w:rPr>
-              <w:t xml:space="preserve">Вычисляется по формуле (2.10)</w:t>
+            <w:r>
+              <w:rPr>
+                <w:sz w:val="24"/>
+                <w:szCs w:val="24"/>
+              </w:rPr>
+              <w:t xml:space="preserve"> </w:t>
+            </w:r>
+            <w:r>
+              <w:rPr>
+                <w:sz w:val="24"/>
+                <w:szCs w:val="24"/>
+              </w:rPr>
+              <w:t xml:space="preserve">по формуле (2.10)</w:t>
             </w:r>
           </w:p>
         </w:tc>
@@ -6875,7 +6439,7 @@
         </w:tc>
         <w:tc>
           <w:tcPr>
-            <w:tcW w:w="3851" w:type="dxa"/>
+            <w:tcW w:w="7797" w:type="dxa"/>
           </w:tcPr>
           <w:p>
             <w:pPr>
@@ -6911,53 +6475,7 @@
                 <w:sz w:val="24"/>
                 <w:szCs w:val="24"/>
               </w:rPr>
-              <w:t xml:space="preserve">, читаемая за одно чтение; 1 при полном чтении</w:t>
-            </w:r>
-          </w:p>
-        </w:tc>
-        <w:tc>
-          <w:tcPr>
-            <w:tcW w:w="1270" w:type="dxa"/>
-          </w:tcPr>
-          <w:p>
-            <w:pPr>
-              <w:pStyle w:val="Compact"/>
-              <w:keepNext w:val="0"/>
-              <w:pageBreakBefore w:val="0"/>
-              <w:suppressAutoHyphens w:val="1"/>
-              <w:spacing w:before="0" w:after="0" w:line="240" w:lineRule="auto"/>
-              <w:ind w:firstLine="0" w:left="0" w:right="0"/>
-              <w:jc w:val="both"/>
-            </w:pPr>
-            <w:r>
-              <w:rPr>
-                <w:sz w:val="24"/>
-                <w:szCs w:val="24"/>
-              </w:rPr>
-              <w:t xml:space="preserve">—</w:t>
-            </w:r>
-          </w:p>
-        </w:tc>
-        <w:tc>
-          <w:tcPr>
-            <w:tcW w:w="2676" w:type="dxa"/>
-          </w:tcPr>
-          <w:p>
-            <w:pPr>
-              <w:pStyle w:val="Compact"/>
-              <w:keepNext w:val="0"/>
-              <w:pageBreakBefore w:val="0"/>
-              <w:suppressAutoHyphens w:val="1"/>
-              <w:spacing w:before="0" w:after="0" w:line="240" w:lineRule="auto"/>
-              <w:ind w:firstLine="0" w:left="0" w:right="0"/>
-              <w:jc w:val="both"/>
-            </w:pPr>
-            <w:r>
-              <w:rPr>
-                <w:sz w:val="24"/>
-                <w:szCs w:val="24"/>
-              </w:rPr>
-              <w:t xml:space="preserve">Вычисляется по истории обращений</w:t>
+              <w:t xml:space="preserve">, читаемая за одно чтение, по истории обращений; 1 при полном чтении</w:t>
             </w:r>
           </w:p>
         </w:tc>
@@ -7005,7 +6523,7 @@
         </w:tc>
         <w:tc>
           <w:tcPr>
-            <w:tcW w:w="3851" w:type="dxa"/>
+            <w:tcW w:w="7797" w:type="dxa"/>
           </w:tcPr>
           <w:p>
             <w:pPr>
@@ -7048,7 +6566,7 @@
                 <w:sz w:val="24"/>
                 <w:szCs w:val="24"/>
               </w:rPr>
-              <w:t xml:space="preserve">за горизонт,</w:t>
+              <w:t xml:space="preserve">за горизонт, равный</w:t>
             </w:r>
             <w:r>
               <w:rPr>
@@ -7102,143 +6620,13 @@
                 </m:sub>
               </m:sSub>
             </m:oMath>
-          </w:p>
-        </w:tc>
-        <w:tc>
-          <w:tcPr>
-            <w:tcW w:w="1270" w:type="dxa"/>
-          </w:tcPr>
-          <w:p>
-            <w:pPr>
-              <w:pStyle w:val="Compact"/>
-              <w:keepNext w:val="0"/>
-              <w:pageBreakBefore w:val="0"/>
-              <w:suppressAutoHyphens w:val="1"/>
-              <w:spacing w:before="0" w:after="0" w:line="240" w:lineRule="auto"/>
-              <w:ind w:firstLine="0" w:left="0" w:right="0"/>
-              <w:jc w:val="both"/>
-            </w:pPr>
-            <w:r>
-              <w:rPr>
-                <w:sz w:val="24"/>
-                <w:szCs w:val="24"/>
-              </w:rPr>
-              <w:t xml:space="preserve">МиБ</w:t>
-            </w:r>
-          </w:p>
-        </w:tc>
-        <w:tc>
-          <w:tcPr>
-            <w:tcW w:w="2676" w:type="dxa"/>
-          </w:tcPr>
-          <w:p>
-            <w:pPr>
-              <w:pStyle w:val="Compact"/>
-              <w:keepNext w:val="0"/>
-              <w:pageBreakBefore w:val="0"/>
-              <w:suppressAutoHyphens w:val="1"/>
-              <w:spacing w:before="0" w:after="0" w:line="240" w:lineRule="auto"/>
-              <w:ind w:firstLine="0" w:left="0" w:right="0"/>
-              <w:jc w:val="both"/>
-            </w:pPr>
-            <w:r>
-              <w:rPr>
-                <w:sz w:val="24"/>
-                <w:szCs w:val="24"/>
-              </w:rPr>
-              <w:t xml:space="preserve">Вычисляется по</w:t>
-            </w:r>
-            <w:r>
-              <w:rPr>
-                <w:sz w:val="24"/>
-                <w:szCs w:val="24"/>
-              </w:rPr>
-              <w:t xml:space="preserve"> </w:t>
-            </w:r>
-            <m:oMath>
-              <m:sSub>
-                <m:e>
-                  <m:acc>
-                    <m:accPr>
-                      <m:chr m:val="̂"/>
-                    </m:accPr>
-                    <m:e>
-                      <m:r>
-                        <m:t>N</m:t>
-                      </m:r>
-                    </m:e>
-                  </m:acc>
-                </m:e>
-                <m:sub>
-                  <m:r>
-                    <m:t>i</m:t>
-                  </m:r>
-                </m:sub>
-              </m:sSub>
-            </m:oMath>
-            <w:r>
-              <w:rPr>
-                <w:sz w:val="24"/>
-                <w:szCs w:val="24"/>
-              </w:rPr>
-              <w:t xml:space="preserve">,</w:t>
-            </w:r>
-            <w:r>
-              <w:rPr>
-                <w:sz w:val="24"/>
-                <w:szCs w:val="24"/>
-              </w:rPr>
-              <w:t xml:space="preserve"> </w:t>
-            </w:r>
-            <m:oMath>
-              <m:sSub>
-                <m:e>
-                  <m:r>
-                    <m:t>r</m:t>
-                  </m:r>
-                </m:e>
-                <m:sub>
-                  <m:r>
-                    <m:t>i</m:t>
-                  </m:r>
-                </m:sub>
-              </m:sSub>
-            </m:oMath>
-            <w:r>
-              <w:rPr>
-                <w:sz w:val="24"/>
-                <w:szCs w:val="24"/>
-              </w:rPr>
-              <w:t xml:space="preserve"> </w:t>
-            </w:r>
-            <w:r>
-              <w:rPr>
-                <w:sz w:val="24"/>
-                <w:szCs w:val="24"/>
-              </w:rPr>
-              <w:t xml:space="preserve">и</w:t>
-            </w:r>
-            <w:r>
-              <w:rPr>
-                <w:sz w:val="24"/>
-                <w:szCs w:val="24"/>
-              </w:rPr>
-              <w:t xml:space="preserve"> </w:t>
-            </w:r>
-            <m:oMath>
-              <m:sSub>
-                <m:e>
-                  <m:r>
-                    <m:t>s</m:t>
-                  </m:r>
-                </m:e>
-                <m:sub>
-                  <m:r>
-                    <m:t>i</m:t>
-                  </m:r>
-                </m:sub>
-              </m:sSub>
-            </m:oMath>
+            <w:r>
+              <w:rPr>
+                <w:sz w:val="24"/>
+                <w:szCs w:val="24"/>
+              </w:rPr>
+              <w:t xml:space="preserve">, МиБ</w:t>
+            </w:r>
           </w:p>
         </w:tc>
       </w:tr>
@@ -7278,7 +6666,7 @@
         </w:tc>
         <w:tc>
           <w:tcPr>
-            <w:tcW w:w="3851" w:type="dxa"/>
+            <w:tcW w:w="7797" w:type="dxa"/>
           </w:tcPr>
           <w:p>
             <w:pPr>
@@ -7309,51 +6697,12 @@
                 <m:t>j</m:t>
               </m:r>
             </m:oMath>
-          </w:p>
-        </w:tc>
-        <w:tc>
-          <w:tcPr>
-            <w:tcW w:w="1270" w:type="dxa"/>
-          </w:tcPr>
-          <w:p>
-            <w:pPr>
-              <w:pStyle w:val="Compact"/>
-              <w:keepNext w:val="0"/>
-              <w:pageBreakBefore w:val="0"/>
-              <w:suppressAutoHyphens w:val="1"/>
-              <w:spacing w:before="0" w:after="0" w:line="240" w:lineRule="auto"/>
-              <w:ind w:firstLine="0" w:left="0" w:right="0"/>
-              <w:jc w:val="both"/>
-            </w:pPr>
-            <w:r>
-              <w:rPr>
-                <w:sz w:val="24"/>
-                <w:szCs w:val="24"/>
-              </w:rPr>
-              <w:t xml:space="preserve">мс</w:t>
-            </w:r>
-          </w:p>
-        </w:tc>
-        <w:tc>
-          <w:tcPr>
-            <w:tcW w:w="2676" w:type="dxa"/>
-          </w:tcPr>
-          <w:p>
-            <w:pPr>
-              <w:pStyle w:val="Compact"/>
-              <w:keepNext w:val="0"/>
-              <w:pageBreakBefore w:val="0"/>
-              <w:suppressAutoHyphens w:val="1"/>
-              <w:spacing w:before="0" w:after="0" w:line="240" w:lineRule="auto"/>
-              <w:ind w:firstLine="0" w:left="0" w:right="0"/>
-              <w:jc w:val="both"/>
-            </w:pPr>
-            <w:r>
-              <w:rPr>
-                <w:sz w:val="24"/>
-                <w:szCs w:val="24"/>
-              </w:rPr>
-              <w:t xml:space="preserve">Измеряется на стенде</w:t>
+            <w:r>
+              <w:rPr>
+                <w:sz w:val="24"/>
+                <w:szCs w:val="24"/>
+              </w:rPr>
+              <w:t xml:space="preserve">, мс</w:t>
             </w:r>
           </w:p>
         </w:tc>
@@ -7394,7 +6743,7 @@
         </w:tc>
         <w:tc>
           <w:tcPr>
-            <w:tcW w:w="3851" w:type="dxa"/>
+            <w:tcW w:w="7797" w:type="dxa"/>
           </w:tcPr>
           <w:p>
             <w:pPr>
@@ -7425,51 +6774,12 @@
                 <m:t>j</m:t>
               </m:r>
             </m:oMath>
-          </w:p>
-        </w:tc>
-        <w:tc>
-          <w:tcPr>
-            <w:tcW w:w="1270" w:type="dxa"/>
-          </w:tcPr>
-          <w:p>
-            <w:pPr>
-              <w:pStyle w:val="Compact"/>
-              <w:keepNext w:val="0"/>
-              <w:pageBreakBefore w:val="0"/>
-              <w:suppressAutoHyphens w:val="1"/>
-              <w:spacing w:before="0" w:after="0" w:line="240" w:lineRule="auto"/>
-              <w:ind w:firstLine="0" w:left="0" w:right="0"/>
-              <w:jc w:val="both"/>
-            </w:pPr>
-            <w:r>
-              <w:rPr>
-                <w:sz w:val="24"/>
-                <w:szCs w:val="24"/>
-              </w:rPr>
-              <w:t xml:space="preserve">МиБ/мс</w:t>
-            </w:r>
-          </w:p>
-        </w:tc>
-        <w:tc>
-          <w:tcPr>
-            <w:tcW w:w="2676" w:type="dxa"/>
-          </w:tcPr>
-          <w:p>
-            <w:pPr>
-              <w:pStyle w:val="Compact"/>
-              <w:keepNext w:val="0"/>
-              <w:pageBreakBefore w:val="0"/>
-              <w:suppressAutoHyphens w:val="1"/>
-              <w:spacing w:before="0" w:after="0" w:line="240" w:lineRule="auto"/>
-              <w:ind w:firstLine="0" w:left="0" w:right="0"/>
-              <w:jc w:val="both"/>
-            </w:pPr>
-            <w:r>
-              <w:rPr>
-                <w:sz w:val="24"/>
-                <w:szCs w:val="24"/>
-              </w:rPr>
-              <w:t xml:space="preserve">Измеряется на стенде</w:t>
+            <w:r>
+              <w:rPr>
+                <w:sz w:val="24"/>
+                <w:szCs w:val="24"/>
+              </w:rPr>
+              <w:t xml:space="preserve">, МиБ/мс</w:t>
             </w:r>
           </w:p>
         </w:tc>
@@ -7510,7 +6820,7 @@
         </w:tc>
         <w:tc>
           <w:tcPr>
-            <w:tcW w:w="3851" w:type="dxa"/>
+            <w:tcW w:w="7797" w:type="dxa"/>
           </w:tcPr>
           <w:p>
             <w:pPr>
@@ -7541,51 +6851,12 @@
                 <m:t>j</m:t>
               </m:r>
             </m:oMath>
-          </w:p>
-        </w:tc>
-        <w:tc>
-          <w:tcPr>
-            <w:tcW w:w="1270" w:type="dxa"/>
-          </w:tcPr>
-          <w:p>
-            <w:pPr>
-              <w:pStyle w:val="Compact"/>
-              <w:keepNext w:val="0"/>
-              <w:pageBreakBefore w:val="0"/>
-              <w:suppressAutoHyphens w:val="1"/>
-              <w:spacing w:before="0" w:after="0" w:line="240" w:lineRule="auto"/>
-              <w:ind w:firstLine="0" w:left="0" w:right="0"/>
-              <w:jc w:val="both"/>
-            </w:pPr>
-            <w:r>
-              <w:rPr>
-                <w:sz w:val="24"/>
-                <w:szCs w:val="24"/>
-              </w:rPr>
-              <w:t xml:space="preserve">МиБ</w:t>
-            </w:r>
-          </w:p>
-        </w:tc>
-        <w:tc>
-          <w:tcPr>
-            <w:tcW w:w="2676" w:type="dxa"/>
-          </w:tcPr>
-          <w:p>
-            <w:pPr>
-              <w:pStyle w:val="Compact"/>
-              <w:keepNext w:val="0"/>
-              <w:pageBreakBefore w:val="0"/>
-              <w:suppressAutoHyphens w:val="1"/>
-              <w:spacing w:before="0" w:after="0" w:line="240" w:lineRule="auto"/>
-              <w:ind w:firstLine="0" w:left="0" w:right="0"/>
-              <w:jc w:val="both"/>
-            </w:pPr>
-            <w:r>
-              <w:rPr>
-                <w:sz w:val="24"/>
-                <w:szCs w:val="24"/>
-              </w:rPr>
-              <w:t xml:space="preserve">Каталог Metadata</w:t>
+            <w:r>
+              <w:rPr>
+                <w:sz w:val="24"/>
+                <w:szCs w:val="24"/>
+              </w:rPr>
+              <w:t xml:space="preserve">, МиБ</w:t>
             </w:r>
           </w:p>
         </w:tc>
@@ -7626,7 +6897,7 @@
         </w:tc>
         <w:tc>
           <w:tcPr>
-            <w:tcW w:w="3851" w:type="dxa"/>
+            <w:tcW w:w="7797" w:type="dxa"/>
           </w:tcPr>
           <w:p>
             <w:pPr>
@@ -7657,52 +6928,6 @@
                 <m:t>j</m:t>
               </m:r>
             </m:oMath>
-          </w:p>
-        </w:tc>
-        <w:tc>
-          <w:tcPr>
-            <w:tcW w:w="1270" w:type="dxa"/>
-          </w:tcPr>
-          <w:p>
-            <w:pPr>
-              <w:pStyle w:val="Compact"/>
-              <w:keepNext w:val="0"/>
-              <w:pageBreakBefore w:val="0"/>
-              <w:suppressAutoHyphens w:val="1"/>
-              <w:spacing w:before="0" w:after="0" w:line="240" w:lineRule="auto"/>
-              <w:ind w:firstLine="0" w:left="0" w:right="0"/>
-              <w:jc w:val="both"/>
-            </w:pPr>
-            <w:r>
-              <w:rPr>
-                <w:sz w:val="24"/>
-                <w:szCs w:val="24"/>
-              </w:rPr>
-              <w:t xml:space="preserve">—</w:t>
-            </w:r>
-          </w:p>
-        </w:tc>
-        <w:tc>
-          <w:tcPr>
-            <w:tcW w:w="2676" w:type="dxa"/>
-          </w:tcPr>
-          <w:p>
-            <w:pPr>
-              <w:pStyle w:val="Compact"/>
-              <w:keepNext w:val="0"/>
-              <w:pageBreakBefore w:val="0"/>
-              <w:suppressAutoHyphens w:val="1"/>
-              <w:spacing w:before="0" w:after="0" w:line="240" w:lineRule="auto"/>
-              <w:ind w:firstLine="0" w:left="0" w:right="0"/>
-              <w:jc w:val="both"/>
-            </w:pPr>
-            <w:r>
-              <w:rPr>
-                <w:sz w:val="24"/>
-                <w:szCs w:val="24"/>
-              </w:rPr>
-              <w:t xml:space="preserve">Администратор</w:t>
-            </w:r>
           </w:p>
         </w:tc>
       </w:tr>
@@ -7762,7 +6987,7 @@
         </w:tc>
         <w:tc>
           <w:tcPr>
-            <w:tcW w:w="3851" w:type="dxa"/>
+            <w:tcW w:w="7797" w:type="dxa"/>
           </w:tcPr>
           <w:p>
             <w:pPr>
@@ -7793,51 +7018,12 @@
                 <m:t>j</m:t>
               </m:r>
             </m:oMath>
-          </w:p>
-        </w:tc>
-        <w:tc>
-          <w:tcPr>
-            <w:tcW w:w="1270" w:type="dxa"/>
-          </w:tcPr>
-          <w:p>
-            <w:pPr>
-              <w:pStyle w:val="Compact"/>
-              <w:keepNext w:val="0"/>
-              <w:pageBreakBefore w:val="0"/>
-              <w:suppressAutoHyphens w:val="1"/>
-              <w:spacing w:before="0" w:after="0" w:line="240" w:lineRule="auto"/>
-              <w:ind w:firstLine="0" w:left="0" w:right="0"/>
-              <w:jc w:val="both"/>
-            </w:pPr>
-            <w:r>
-              <w:rPr>
-                <w:sz w:val="24"/>
-                <w:szCs w:val="24"/>
-              </w:rPr>
-              <w:t xml:space="preserve">МиБ</w:t>
-            </w:r>
-          </w:p>
-        </w:tc>
-        <w:tc>
-          <w:tcPr>
-            <w:tcW w:w="2676" w:type="dxa"/>
-          </w:tcPr>
-          <w:p>
-            <w:pPr>
-              <w:pStyle w:val="Compact"/>
-              <w:keepNext w:val="0"/>
-              <w:pageBreakBefore w:val="0"/>
-              <w:suppressAutoHyphens w:val="1"/>
-              <w:spacing w:before="0" w:after="0" w:line="240" w:lineRule="auto"/>
-              <w:ind w:firstLine="0" w:left="0" w:right="0"/>
-              <w:jc w:val="both"/>
-            </w:pPr>
-            <w:r>
-              <w:rPr>
-                <w:sz w:val="24"/>
-                <w:szCs w:val="24"/>
-              </w:rPr>
-              <w:t xml:space="preserve">Каталог Metadata</w:t>
+            <w:r>
+              <w:rPr>
+                <w:sz w:val="24"/>
+                <w:szCs w:val="24"/>
+              </w:rPr>
+              <w:t xml:space="preserve">, МиБ</w:t>
             </w:r>
           </w:p>
         </w:tc>
@@ -7898,7 +7084,7 @@
         </w:tc>
         <w:tc>
           <w:tcPr>
-            <w:tcW w:w="3851" w:type="dxa"/>
+            <w:tcW w:w="7797" w:type="dxa"/>
           </w:tcPr>
           <w:p>
             <w:pPr>
@@ -7929,51 +7115,12 @@
                 <m:t>j</m:t>
               </m:r>
             </m:oMath>
-          </w:p>
-        </w:tc>
-        <w:tc>
-          <w:tcPr>
-            <w:tcW w:w="1270" w:type="dxa"/>
-          </w:tcPr>
-          <w:p>
-            <w:pPr>
-              <w:pStyle w:val="Compact"/>
-              <w:keepNext w:val="0"/>
-              <w:pageBreakBefore w:val="0"/>
-              <w:suppressAutoHyphens w:val="1"/>
-              <w:spacing w:before="0" w:after="0" w:line="240" w:lineRule="auto"/>
-              <w:ind w:firstLine="0" w:left="0" w:right="0"/>
-              <w:jc w:val="both"/>
-            </w:pPr>
-            <w:r>
-              <w:rPr>
-                <w:sz w:val="24"/>
-                <w:szCs w:val="24"/>
-              </w:rPr>
-              <w:t xml:space="preserve">МиБ</w:t>
-            </w:r>
-          </w:p>
-        </w:tc>
-        <w:tc>
-          <w:tcPr>
-            <w:tcW w:w="2676" w:type="dxa"/>
-          </w:tcPr>
-          <w:p>
-            <w:pPr>
-              <w:pStyle w:val="Compact"/>
-              <w:keepNext w:val="0"/>
-              <w:pageBreakBefore w:val="0"/>
-              <w:suppressAutoHyphens w:val="1"/>
-              <w:spacing w:before="0" w:after="0" w:line="240" w:lineRule="auto"/>
-              <w:ind w:firstLine="0" w:left="0" w:right="0"/>
-              <w:jc w:val="both"/>
-            </w:pPr>
-            <w:r>
-              <w:rPr>
-                <w:sz w:val="24"/>
-                <w:szCs w:val="24"/>
-              </w:rPr>
-              <w:t xml:space="preserve">Каталог Metadata</w:t>
+            <w:r>
+              <w:rPr>
+                <w:sz w:val="24"/>
+                <w:szCs w:val="24"/>
+              </w:rPr>
+              <w:t xml:space="preserve">, МиБ</w:t>
             </w:r>
           </w:p>
         </w:tc>
@@ -8005,7 +7152,7 @@
         </w:tc>
         <w:tc>
           <w:tcPr>
-            <w:tcW w:w="3851" w:type="dxa"/>
+            <w:tcW w:w="7797" w:type="dxa"/>
           </w:tcPr>
           <w:p>
             <w:pPr>
@@ -8022,53 +7169,7 @@
                 <w:sz w:val="24"/>
                 <w:szCs w:val="24"/>
               </w:rPr>
-              <w:t xml:space="preserve">Остаток бюджета копирования на цикл за вычетом выполняемых переносов и неуспешных попыток</w:t>
-            </w:r>
-          </w:p>
-        </w:tc>
-        <w:tc>
-          <w:tcPr>
-            <w:tcW w:w="1270" w:type="dxa"/>
-          </w:tcPr>
-          <w:p>
-            <w:pPr>
-              <w:pStyle w:val="Compact"/>
-              <w:keepNext w:val="0"/>
-              <w:pageBreakBefore w:val="0"/>
-              <w:suppressAutoHyphens w:val="1"/>
-              <w:spacing w:before="0" w:after="0" w:line="240" w:lineRule="auto"/>
-              <w:ind w:firstLine="0" w:left="0" w:right="0"/>
-              <w:jc w:val="both"/>
-            </w:pPr>
-            <w:r>
-              <w:rPr>
-                <w:sz w:val="24"/>
-                <w:szCs w:val="24"/>
-              </w:rPr>
-              <w:t xml:space="preserve">МиБ</w:t>
-            </w:r>
-          </w:p>
-        </w:tc>
-        <w:tc>
-          <w:tcPr>
-            <w:tcW w:w="2676" w:type="dxa"/>
-          </w:tcPr>
-          <w:p>
-            <w:pPr>
-              <w:pStyle w:val="Compact"/>
-              <w:keepNext w:val="0"/>
-              <w:pageBreakBefore w:val="0"/>
-              <w:suppressAutoHyphens w:val="1"/>
-              <w:spacing w:before="0" w:after="0" w:line="240" w:lineRule="auto"/>
-              <w:ind w:firstLine="0" w:left="0" w:right="0"/>
-              <w:jc w:val="both"/>
-            </w:pPr>
-            <w:r>
-              <w:rPr>
-                <w:sz w:val="24"/>
-                <w:szCs w:val="24"/>
-              </w:rPr>
-              <w:t xml:space="preserve">Бюджет задаёт администратор, остаток вычисляется</w:t>
+              <w:t xml:space="preserve">Остаток бюджета копирования на цикл за вычетом выполняемых переносов и неуспешных попыток, МиБ</w:t>
             </w:r>
           </w:p>
         </w:tc>
@@ -8100,7 +7201,7 @@
         </w:tc>
         <w:tc>
           <w:tcPr>
-            <w:tcW w:w="3851" w:type="dxa"/>
+            <w:tcW w:w="7797" w:type="dxa"/>
           </w:tcPr>
           <w:p>
             <w:pPr>
@@ -8117,53 +7218,7 @@
                 <w:sz w:val="24"/>
                 <w:szCs w:val="24"/>
               </w:rPr>
-              <w:t xml:space="preserve">Штраф за перенос 1 МиБ</w:t>
-            </w:r>
-          </w:p>
-        </w:tc>
-        <w:tc>
-          <w:tcPr>
-            <w:tcW w:w="1270" w:type="dxa"/>
-          </w:tcPr>
-          <w:p>
-            <w:pPr>
-              <w:pStyle w:val="Compact"/>
-              <w:keepNext w:val="0"/>
-              <w:pageBreakBefore w:val="0"/>
-              <w:suppressAutoHyphens w:val="1"/>
-              <w:spacing w:before="0" w:after="0" w:line="240" w:lineRule="auto"/>
-              <w:ind w:firstLine="0" w:left="0" w:right="0"/>
-              <w:jc w:val="both"/>
-            </w:pPr>
-            <w:r>
-              <w:rPr>
-                <w:sz w:val="24"/>
-                <w:szCs w:val="24"/>
-              </w:rPr>
-              <w:t xml:space="preserve">мс/МиБ</w:t>
-            </w:r>
-          </w:p>
-        </w:tc>
-        <w:tc>
-          <w:tcPr>
-            <w:tcW w:w="2676" w:type="dxa"/>
-          </w:tcPr>
-          <w:p>
-            <w:pPr>
-              <w:pStyle w:val="Compact"/>
-              <w:keepNext w:val="0"/>
-              <w:pageBreakBefore w:val="0"/>
-              <w:suppressAutoHyphens w:val="1"/>
-              <w:spacing w:before="0" w:after="0" w:line="240" w:lineRule="auto"/>
-              <w:ind w:firstLine="0" w:left="0" w:right="0"/>
-              <w:jc w:val="both"/>
-            </w:pPr>
-            <w:r>
-              <w:rPr>
-                <w:sz w:val="24"/>
-                <w:szCs w:val="24"/>
-              </w:rPr>
-              <w:t xml:space="preserve">Подбирается на данных настройки</w:t>
+              <w:t xml:space="preserve">Штраф за перенос 1 МиБ, мс/МиБ</w:t>
             </w:r>
           </w:p>
         </w:tc>
@@ -8210,7 +7265,7 @@
         </w:tc>
         <w:tc>
           <w:tcPr>
-            <w:tcW w:w="3851" w:type="dxa"/>
+            <w:tcW w:w="7797" w:type="dxa"/>
           </w:tcPr>
           <w:p>
             <w:pPr>
@@ -8227,53 +7282,7 @@
                 <w:sz w:val="24"/>
                 <w:szCs w:val="24"/>
               </w:rPr>
-              <w:t xml:space="preserve">Минимальный выигрыш набора переносов</w:t>
-            </w:r>
-          </w:p>
-        </w:tc>
-        <w:tc>
-          <w:tcPr>
-            <w:tcW w:w="1270" w:type="dxa"/>
-          </w:tcPr>
-          <w:p>
-            <w:pPr>
-              <w:pStyle w:val="Compact"/>
-              <w:keepNext w:val="0"/>
-              <w:pageBreakBefore w:val="0"/>
-              <w:suppressAutoHyphens w:val="1"/>
-              <w:spacing w:before="0" w:after="0" w:line="240" w:lineRule="auto"/>
-              <w:ind w:firstLine="0" w:left="0" w:right="0"/>
-              <w:jc w:val="both"/>
-            </w:pPr>
-            <w:r>
-              <w:rPr>
-                <w:sz w:val="24"/>
-                <w:szCs w:val="24"/>
-              </w:rPr>
-              <w:t xml:space="preserve">мс</w:t>
-            </w:r>
-          </w:p>
-        </w:tc>
-        <w:tc>
-          <w:tcPr>
-            <w:tcW w:w="2676" w:type="dxa"/>
-          </w:tcPr>
-          <w:p>
-            <w:pPr>
-              <w:pStyle w:val="Compact"/>
-              <w:keepNext w:val="0"/>
-              <w:pageBreakBefore w:val="0"/>
-              <w:suppressAutoHyphens w:val="1"/>
-              <w:spacing w:before="0" w:after="0" w:line="240" w:lineRule="auto"/>
-              <w:ind w:firstLine="0" w:left="0" w:right="0"/>
-              <w:jc w:val="both"/>
-            </w:pPr>
-            <w:r>
-              <w:rPr>
-                <w:sz w:val="24"/>
-                <w:szCs w:val="24"/>
-              </w:rPr>
-              <w:t xml:space="preserve">Подбирается на данных настройки</w:t>
+              <w:t xml:space="preserve">Минимальный выигрыш набора переносов, мс</w:t>
             </w:r>
           </w:p>
         </w:tc>
@@ -8286,7 +7295,130 @@
         <w:spacing w:before="120"/>
       </w:pPr>
       <w:r>
-        <w:t xml:space="preserve">Ёмкость ограничивает размещение с учётом временных копий и предыдущих версий, а бюджет — объём переносов за цикл, поэтому при выборе плана проверяются оба ограничения.</w:t>
+        <w:t xml:space="preserve">Параметры</w:t>
+      </w:r>
+      <w:r>
+        <w:t xml:space="preserve"> </w:t>
+      </w:r>
+      <m:oMath>
+        <m:sSub>
+          <m:e>
+            <m:r>
+              <m:t>c</m:t>
+            </m:r>
+          </m:e>
+          <m:sub>
+            <m:r>
+              <m:t>j</m:t>
+            </m:r>
+          </m:sub>
+        </m:sSub>
+      </m:oMath>
+      <w:r>
+        <w:t xml:space="preserve"> </w:t>
+      </w:r>
+      <w:r>
+        <w:t xml:space="preserve">и</w:t>
+      </w:r>
+      <w:r>
+        <w:t xml:space="preserve"> </w:t>
+      </w:r>
+      <m:oMath>
+        <m:sSub>
+          <m:e>
+            <m:r>
+              <m:t>v</m:t>
+            </m:r>
+          </m:e>
+          <m:sub>
+            <m:r>
+              <m:t>j</m:t>
+            </m:r>
+          </m:sub>
+        </m:sSub>
+      </m:oMath>
+      <w:r>
+        <w:t xml:space="preserve"> </w:t>
+      </w:r>
+      <w:r>
+        <w:t xml:space="preserve">измеряются на стенде, долю</w:t>
+      </w:r>
+      <w:r>
+        <w:t xml:space="preserve"> </w:t>
+      </w:r>
+      <m:oMath>
+        <m:sSub>
+          <m:e>
+            <m:r>
+              <m:t>u</m:t>
+            </m:r>
+          </m:e>
+          <m:sub>
+            <m:r>
+              <m:t>j</m:t>
+            </m:r>
+          </m:sub>
+        </m:sSub>
+      </m:oMath>
+      <w:r>
+        <w:t xml:space="preserve"> </w:t>
+      </w:r>
+      <w:r>
+        <w:t xml:space="preserve">и бюджет копирования задаёт администратор, а</w:t>
+      </w:r>
+      <w:r>
+        <w:t xml:space="preserve"> </w:t>
+      </w:r>
+      <m:oMath>
+        <m:r>
+          <m:t>H</m:t>
+        </m:r>
+      </m:oMath>
+      <w:r>
+        <w:t xml:space="preserve">,</w:t>
+      </w:r>
+      <w:r>
+        <w:t xml:space="preserve"> </w:t>
+      </w:r>
+      <m:oMath>
+        <m:r>
+          <m:t>P</m:t>
+        </m:r>
+      </m:oMath>
+      <w:r>
+        <w:t xml:space="preserve"> </w:t>
+      </w:r>
+      <w:r>
+        <w:t xml:space="preserve">и</w:t>
+      </w:r>
+      <w:r>
+        <w:t xml:space="preserve"> </w:t>
+      </w:r>
+      <m:oMath>
+        <m:sSub>
+          <m:e>
+            <m:r>
+              <m:rPr>
+                <m:sty m:val="p"/>
+              </m:rPr>
+              <m:t>Δ</m:t>
+            </m:r>
+          </m:e>
+          <m:sub>
+            <m:r>
+              <m:rPr>
+                <m:sty m:val="p"/>
+              </m:rPr>
+              <m:t>min</m:t>
+            </m:r>
+          </m:sub>
+        </m:sSub>
+      </m:oMath>
+      <w:r>
+        <w:t xml:space="preserve"> </w:t>
+      </w:r>
+      <w:r>
+        <w:t xml:space="preserve">подбираются на данных настройки. Ёмкость ограничивает размещение с учётом временных копий и предыдущих версий, а бюджет — объём переносов за цикл, поэтому при выборе плана проверяются оба ограничения.</w:t>
       </w:r>
     </w:p>
     <w:p>
@@ -12296,7 +11428,7 @@
         <w:pStyle w:val="FirstParagraph"/>
       </w:pPr>
       <w:r>
-        <w:t xml:space="preserve">Штатные метрики Gateway агрегированы и не различают объекты [7], поэтому Gateway дополняется публикацией событий клиентских чтений с номером Gateway и порядковым номером. Чтения исполнителя идут мимо Gateway и в спрос не попадают, а текущий класс и задержка не входят в признаки, иначе медленный COLD выглядел бы как снижение спроса.</w:t>
+        <w:t xml:space="preserve">Для прогноза нужна история чтений каждого объекта, а штатные метрики шлюза OpenS3 агрегированы и объекты не различают [7]. Поэтому шлюз дополняется публикацией события на каждое клиентское чтение с номером экземпляра шлюза и порядковым номером события. Исполнитель переносов читает данные в обход шлюза, поэтому копирование не попадает в историю спроса. Текущий класс и задержка чтения в признаки не входят, так как отражают прежнее решение о размещении, а не спрос: иначе модель связала бы медленные чтения из COLD с низкой востребованностью и закрепляла бы объекты в COLD.</w:t>
       </w:r>
     </w:p>
     <w:p>
@@ -14765,7 +13897,7 @@
         <w:ind w:left="1276" w:hanging="567"/>
       </w:pPr>
       <w:r>
-        <w:t xml:space="preserve">Источник удаляется после паузы, превышающей предельное время чтения в Gateway.</w:t>
+        <w:t xml:space="preserve">Источник удаляется после паузы, превышающей предельное время чтения в шлюзе.</w:t>
       </w:r>
     </w:p>
     <w:p>

</xml_diff>